<commit_message>
meeting log 2-16-26 through 2-22-26
</commit_message>
<xml_diff>
--- a/documentation/Meeting Logs/Meeting Log 2-16-26 through 2-22-26.docx
+++ b/documentation/Meeting Logs/Meeting Log 2-16-26 through 2-22-26.docx
@@ -562,14 +562,7 @@
                 <w:sz w:val="22"/>
                 <w:szCs w:val="22"/>
               </w:rPr>
-              <w:t>Nathan Carlson, Kyler Cressall, Eric Parral</w:t>
-            </w:r>
-            <w:r>
-              <w:rPr>
-                <w:sz w:val="22"/>
-                <w:szCs w:val="22"/>
-              </w:rPr>
-              <w:t>, Thomas Ross</w:t>
+              <w:t>Nathan Carlson, Kyler Cressall, Eric Parral, Thomas Ross</w:t>
             </w:r>
           </w:p>
         </w:tc>
@@ -1309,7 +1302,23 @@
           <w:sz w:val="16"/>
           <w:szCs w:val="16"/>
         </w:rPr>
-        <w:t>Since this is a small project, you may not have formal ownership roles. Instead, list the team member assigned to each action item. In larger projects, ownership and assignment are typically separate roles.</w:t>
+        <w:t xml:space="preserve">Since this is a small project, you may not have formal ownership roles. Instead, list the team </w:t>
+      </w:r>
+      <w:proofErr w:type="gramStart"/>
+      <w:r>
+        <w:rPr>
+          <w:sz w:val="16"/>
+          <w:szCs w:val="16"/>
+        </w:rPr>
+        <w:t>member</w:t>
+      </w:r>
+      <w:proofErr w:type="gramEnd"/>
+      <w:r>
+        <w:rPr>
+          <w:sz w:val="16"/>
+          <w:szCs w:val="16"/>
+        </w:rPr>
+        <w:t xml:space="preserve"> assigned to each action item. In larger projects, ownership and assignment are typically separate roles.</w:t>
       </w:r>
     </w:p>
     <w:tbl>
@@ -1572,14 +1581,32 @@
           <w:sz w:val="22"/>
           <w:szCs w:val="22"/>
         </w:rPr>
-        <w:t>Signature (if required):</w:t>
-      </w:r>
-      <w:r>
-        <w:rPr>
-          <w:sz w:val="22"/>
-          <w:szCs w:val="22"/>
-        </w:rPr>
-        <w:t xml:space="preserve"> ____________________</w:t>
+        <w:t>Signature (if required</w:t>
+      </w:r>
+      <w:proofErr w:type="gramStart"/>
+      <w:r>
+        <w:rPr>
+          <w:b/>
+          <w:bCs/>
+          <w:sz w:val="22"/>
+          <w:szCs w:val="22"/>
+        </w:rPr>
+        <w:t>):</w:t>
+      </w:r>
+      <w:r>
+        <w:rPr>
+          <w:sz w:val="22"/>
+          <w:szCs w:val="22"/>
+        </w:rPr>
+        <w:t xml:space="preserve"> _</w:t>
+      </w:r>
+      <w:proofErr w:type="gramEnd"/>
+      <w:r>
+        <w:rPr>
+          <w:sz w:val="22"/>
+          <w:szCs w:val="22"/>
+        </w:rPr>
+        <w:t>___________________</w:t>
       </w:r>
     </w:p>
     <w:p>

</xml_diff>

<commit_message>
Added meeting 3 to meeting log for 2/21/26
</commit_message>
<xml_diff>
--- a/documentation/Meeting Logs/Meeting Log 2-16-26 through 2-22-26.docx
+++ b/documentation/Meeting Logs/Meeting Log 2-16-26 through 2-22-26.docx
@@ -586,6 +586,13 @@
               </w:rPr>
               <w:t>3</w:t>
             </w:r>
+            <w:r>
+              <w:rPr>
+                <w:sz w:val="22"/>
+                <w:szCs w:val="22"/>
+              </w:rPr>
+              <w:t xml:space="preserve"> Zoom</w:t>
+            </w:r>
           </w:p>
         </w:tc>
         <w:tc>
@@ -599,6 +606,13 @@
                 <w:szCs w:val="22"/>
               </w:rPr>
             </w:pPr>
+            <w:r>
+              <w:rPr>
+                <w:sz w:val="22"/>
+                <w:szCs w:val="22"/>
+              </w:rPr>
+              <w:t>2-21-26</w:t>
+            </w:r>
           </w:p>
         </w:tc>
         <w:tc>
@@ -612,6 +626,13 @@
                 <w:szCs w:val="22"/>
               </w:rPr>
             </w:pPr>
+            <w:r>
+              <w:rPr>
+                <w:sz w:val="22"/>
+                <w:szCs w:val="22"/>
+              </w:rPr>
+              <w:t>8:00</w:t>
+            </w:r>
           </w:p>
         </w:tc>
         <w:tc>
@@ -625,6 +646,13 @@
                 <w:szCs w:val="22"/>
               </w:rPr>
             </w:pPr>
+            <w:r>
+              <w:rPr>
+                <w:sz w:val="22"/>
+                <w:szCs w:val="22"/>
+              </w:rPr>
+              <w:t>Nathan Carlson, Thomas Ross</w:t>
+            </w:r>
           </w:p>
         </w:tc>
       </w:tr>
@@ -773,6 +801,34 @@
         </w:rPr>
         <w:t>Meeting 3:</w:t>
       </w:r>
+      <w:r>
+        <w:rPr>
+          <w:sz w:val="22"/>
+          <w:szCs w:val="22"/>
+        </w:rPr>
+        <w:t xml:space="preserve"> </w:t>
+      </w:r>
+      <w:r>
+        <w:rPr>
+          <w:sz w:val="22"/>
+          <w:szCs w:val="22"/>
+        </w:rPr>
+        <w:t xml:space="preserve">Started working </w:t>
+      </w:r>
+      <w:r>
+        <w:rPr>
+          <w:sz w:val="22"/>
+          <w:szCs w:val="22"/>
+        </w:rPr>
+        <w:t>on list view.</w:t>
+      </w:r>
+      <w:r>
+        <w:rPr>
+          <w:sz w:val="22"/>
+          <w:szCs w:val="22"/>
+        </w:rPr>
+        <w:t xml:space="preserve"> </w:t>
+      </w:r>
     </w:p>
     <w:p>
       <w:pPr>
@@ -853,6 +909,21 @@
       </w:pPr>
       <w:r>
         <w:rPr>
+          <w:sz w:val="22"/>
+          <w:szCs w:val="22"/>
+        </w:rPr>
+        <w:t xml:space="preserve">Meeting 3: </w:t>
+      </w:r>
+    </w:p>
+    <w:p>
+      <w:pPr>
+        <w:rPr>
+          <w:sz w:val="22"/>
+          <w:szCs w:val="22"/>
+        </w:rPr>
+      </w:pPr>
+      <w:r>
+        <w:rPr>
           <w:b/>
           <w:bCs/>
           <w:sz w:val="22"/>
@@ -911,6 +982,7 @@
           <w:sz w:val="22"/>
           <w:szCs w:val="22"/>
         </w:rPr>
+        <w:lastRenderedPageBreak/>
         <w:t xml:space="preserve">Meeting 2: </w:t>
       </w:r>
       <w:r>
@@ -933,6 +1005,28 @@
           <w:szCs w:val="22"/>
         </w:rPr>
         <w:t xml:space="preserve"> this meeting. </w:t>
+      </w:r>
+    </w:p>
+    <w:p>
+      <w:pPr>
+        <w:rPr>
+          <w:sz w:val="22"/>
+          <w:szCs w:val="22"/>
+        </w:rPr>
+      </w:pPr>
+      <w:r>
+        <w:rPr>
+          <w:sz w:val="22"/>
+          <w:szCs w:val="22"/>
+        </w:rPr>
+        <w:t>Meeting 3:</w:t>
+      </w:r>
+      <w:r>
+        <w:rPr>
+          <w:sz w:val="22"/>
+          <w:szCs w:val="22"/>
+        </w:rPr>
+        <w:t xml:space="preserve"> Make progress on the API calls for gas prices. Thomas and Eric will touch base on their overlapping tasks.</w:t>
       </w:r>
     </w:p>
     <w:p>
@@ -1043,7 +1137,14 @@
           <w:sz w:val="22"/>
           <w:szCs w:val="22"/>
         </w:rPr>
-        <w:t xml:space="preserve">Meeting 3- </w:t>
+        <w:t>Meeting 3-</w:t>
+      </w:r>
+      <w:r>
+        <w:rPr>
+          <w:sz w:val="22"/>
+          <w:szCs w:val="22"/>
+        </w:rPr>
+        <w:t xml:space="preserve"> Thomas and Nathan will be working on their tasks on Sunday and the beginning of next week, respectively.</w:t>
       </w:r>
     </w:p>
     <w:p>
@@ -1302,23 +1403,7 @@
           <w:sz w:val="16"/>
           <w:szCs w:val="16"/>
         </w:rPr>
-        <w:t xml:space="preserve">Since this is a small project, you may not have formal ownership roles. Instead, list the team </w:t>
-      </w:r>
-      <w:proofErr w:type="gramStart"/>
-      <w:r>
-        <w:rPr>
-          <w:sz w:val="16"/>
-          <w:szCs w:val="16"/>
-        </w:rPr>
-        <w:t>member</w:t>
-      </w:r>
-      <w:proofErr w:type="gramEnd"/>
-      <w:r>
-        <w:rPr>
-          <w:sz w:val="16"/>
-          <w:szCs w:val="16"/>
-        </w:rPr>
-        <w:t xml:space="preserve"> assigned to each action item. In larger projects, ownership and assignment are typically separate roles.</w:t>
+        <w:t>Since this is a small project, you may not have formal ownership roles. Instead, list the team member assigned to each action item. In larger projects, ownership and assignment are typically separate roles.</w:t>
       </w:r>
     </w:p>
     <w:tbl>
@@ -1553,6 +1638,7 @@
           <w:sz w:val="22"/>
           <w:szCs w:val="22"/>
         </w:rPr>
+        <w:lastRenderedPageBreak/>
         <w:t>Team Lead Name:</w:t>
       </w:r>
       <w:r>
@@ -1581,32 +1667,14 @@
           <w:sz w:val="22"/>
           <w:szCs w:val="22"/>
         </w:rPr>
-        <w:t>Signature (if required</w:t>
-      </w:r>
-      <w:proofErr w:type="gramStart"/>
-      <w:r>
-        <w:rPr>
-          <w:b/>
-          <w:bCs/>
-          <w:sz w:val="22"/>
-          <w:szCs w:val="22"/>
-        </w:rPr>
-        <w:t>):</w:t>
-      </w:r>
-      <w:r>
-        <w:rPr>
-          <w:sz w:val="22"/>
-          <w:szCs w:val="22"/>
-        </w:rPr>
-        <w:t xml:space="preserve"> _</w:t>
-      </w:r>
-      <w:proofErr w:type="gramEnd"/>
-      <w:r>
-        <w:rPr>
-          <w:sz w:val="22"/>
-          <w:szCs w:val="22"/>
-        </w:rPr>
-        <w:t>___________________</w:t>
+        <w:t>Signature (if required):</w:t>
+      </w:r>
+      <w:r>
+        <w:rPr>
+          <w:sz w:val="22"/>
+          <w:szCs w:val="22"/>
+        </w:rPr>
+        <w:t xml:space="preserve"> ____________________</w:t>
       </w:r>
     </w:p>
     <w:p>
@@ -1657,7 +1725,6 @@
           <w:sz w:val="22"/>
           <w:szCs w:val="22"/>
         </w:rPr>
-        <w:lastRenderedPageBreak/>
         <w:t>This meeting log supports accountability, progress tracking, and early risk identification. Logs may be reviewed periodically to assess team participation and project momentum.</w:t>
       </w:r>
     </w:p>
@@ -1912,21 +1979,12 @@
         <w:szCs w:val="16"/>
       </w:rPr>
     </w:pPr>
-    <w:proofErr w:type="spellStart"/>
     <w:r>
       <w:rPr>
         <w:sz w:val="16"/>
         <w:szCs w:val="16"/>
       </w:rPr>
-      <w:t>ioverflowSolutions</w:t>
-    </w:r>
-    <w:proofErr w:type="spellEnd"/>
-    <w:r>
-      <w:rPr>
-        <w:sz w:val="16"/>
-        <w:szCs w:val="16"/>
-      </w:rPr>
-      <w:t xml:space="preserve"> copyright</w:t>
+      <w:t>ioverflowSolutions copyright</w:t>
     </w:r>
   </w:p>
 </w:ftr>

</xml_diff>